<commit_message>
docker - dockerfile file updated
</commit_message>
<xml_diff>
--- a/Docker/8-dockerfile.docx
+++ b/Docker/8-dockerfile.docx
@@ -260,7 +260,27 @@
           <w:sz w:val="28"/>
           <w:szCs w:val="28"/>
         </w:rPr>
-        <w:t xml:space="preserve"> must start by defining a base image using the FROM instruction. This image provides the starting point</w:t>
+        <w:t xml:space="preserve"> must start by defining a base image using the </w:t>
+      </w:r>
+      <w:r>
+        <w:rPr>
+          <w:rFonts w:asciiTheme="majorBidi" w:hAnsiTheme="majorBidi" w:cstheme="majorBidi"/>
+          <w:b/>
+          <w:bCs/>
+          <w:i/>
+          <w:iCs/>
+          <w:sz w:val="28"/>
+          <w:szCs w:val="28"/>
+        </w:rPr>
+        <w:t>FROM</w:t>
+      </w:r>
+      <w:r>
+        <w:rPr>
+          <w:rFonts w:asciiTheme="majorBidi" w:hAnsiTheme="majorBidi" w:cstheme="majorBidi"/>
+          <w:sz w:val="28"/>
+          <w:szCs w:val="28"/>
+        </w:rPr>
+        <w:t xml:space="preserve"> instruction. This image provides the starting point</w:t>
       </w:r>
       <w:r>
         <w:rPr>
@@ -1799,6 +1819,7 @@
         </w:numPr>
         <w:spacing w:after="0"/>
         <w:ind w:left="360"/>
+        <w:jc w:val="both"/>
         <w:rPr>
           <w:rFonts w:asciiTheme="majorBidi" w:hAnsiTheme="majorBidi" w:cstheme="majorBidi"/>
           <w:sz w:val="28"/>
@@ -1823,23 +1844,7 @@
           <w:sz w:val="28"/>
           <w:szCs w:val="28"/>
         </w:rPr>
-        <w:t>→</w:t>
-      </w:r>
-      <w:r>
-        <w:rPr>
-          <w:rFonts w:asciiTheme="majorBidi" w:hAnsiTheme="majorBidi" w:cstheme="majorBidi"/>
-          <w:sz w:val="28"/>
-          <w:szCs w:val="28"/>
-        </w:rPr>
-        <w:t xml:space="preserve"> </w:t>
-      </w:r>
-      <w:r>
-        <w:rPr>
-          <w:rFonts w:asciiTheme="majorBidi" w:hAnsiTheme="majorBidi" w:cstheme="majorBidi"/>
-          <w:sz w:val="28"/>
-          <w:szCs w:val="28"/>
-        </w:rPr>
-        <w:t xml:space="preserve">explicitly defines the default shell that will be used to execute any subsequent instructions that support shell form syntax in a </w:t>
+        <w:t xml:space="preserve">→ explicitly defines the default shell that will be used to execute any subsequent instructions that support shell form syntax in a </w:t>
       </w:r>
       <w:proofErr w:type="spellStart"/>
       <w:r>
@@ -1859,15 +1864,7 @@
           <w:sz w:val="28"/>
           <w:szCs w:val="28"/>
         </w:rPr>
-        <w:t xml:space="preserve">. </w:t>
-      </w:r>
-      <w:r>
-        <w:rPr>
-          <w:rFonts w:asciiTheme="majorBidi" w:hAnsiTheme="majorBidi" w:cstheme="majorBidi"/>
-          <w:sz w:val="28"/>
-          <w:szCs w:val="28"/>
-        </w:rPr>
-        <w:t>By default, Docker uses /bin/</w:t>
+        <w:t>. By default, Docker uses /bin/</w:t>
       </w:r>
       <w:proofErr w:type="spellStart"/>
       <w:r>
@@ -1885,36 +1882,33 @@
           <w:sz w:val="28"/>
           <w:szCs w:val="28"/>
         </w:rPr>
-        <w:t xml:space="preserve"> -c as the shell interpreter for shell-form instructions.</w:t>
-      </w:r>
-      <w:r>
-        <w:rPr>
-          <w:rFonts w:asciiTheme="majorBidi" w:hAnsiTheme="majorBidi" w:cstheme="majorBidi"/>
-          <w:sz w:val="28"/>
-          <w:szCs w:val="28"/>
-        </w:rPr>
-        <w:t xml:space="preserve"> </w:t>
-      </w:r>
-      <w:r>
-        <w:rPr>
-          <w:rFonts w:asciiTheme="majorBidi" w:hAnsiTheme="majorBidi" w:cstheme="majorBidi"/>
-          <w:sz w:val="28"/>
-          <w:szCs w:val="28"/>
-        </w:rPr>
-        <w:t>The SHELL instruction allows you to override this default</w:t>
-      </w:r>
-      <w:r>
-        <w:rPr>
-          <w:rFonts w:asciiTheme="majorBidi" w:hAnsiTheme="majorBidi" w:cstheme="majorBidi"/>
-          <w:sz w:val="28"/>
-          <w:szCs w:val="28"/>
-        </w:rPr>
-        <w:t>. Example:</w:t>
+        <w:t xml:space="preserve"> -c as the shell interpreter for shell-form instructions. The </w:t>
+      </w:r>
+      <w:r>
+        <w:rPr>
+          <w:rFonts w:asciiTheme="majorBidi" w:hAnsiTheme="majorBidi" w:cstheme="majorBidi"/>
+          <w:b/>
+          <w:bCs/>
+          <w:i/>
+          <w:iCs/>
+          <w:sz w:val="28"/>
+          <w:szCs w:val="28"/>
+        </w:rPr>
+        <w:t>SHELL</w:t>
+      </w:r>
+      <w:r>
+        <w:rPr>
+          <w:rFonts w:asciiTheme="majorBidi" w:hAnsiTheme="majorBidi" w:cstheme="majorBidi"/>
+          <w:sz w:val="28"/>
+          <w:szCs w:val="28"/>
+        </w:rPr>
+        <w:t xml:space="preserve"> instruction allows you to override this default. Example:</w:t>
       </w:r>
     </w:p>
     <w:p>
       <w:pPr>
         <w:ind w:left="360"/>
+        <w:jc w:val="both"/>
         <w:rPr>
           <w:rFonts w:asciiTheme="majorBidi" w:hAnsiTheme="majorBidi" w:cstheme="majorBidi"/>
           <w:b/>
@@ -2098,6 +2092,7 @@
           <w:numId w:val="22"/>
         </w:numPr>
         <w:ind w:left="720"/>
+        <w:jc w:val="both"/>
         <w:rPr>
           <w:rFonts w:asciiTheme="majorBidi" w:hAnsiTheme="majorBidi" w:cstheme="majorBidi"/>
           <w:sz w:val="28"/>
@@ -2134,31 +2129,7 @@
           <w:sz w:val="28"/>
           <w:szCs w:val="28"/>
         </w:rPr>
-        <w:t xml:space="preserve"> (default = </w:t>
-      </w:r>
-      <w:r>
-        <w:rPr>
-          <w:rFonts w:asciiTheme="majorBidi" w:hAnsiTheme="majorBidi" w:cstheme="majorBidi"/>
-          <w:sz w:val="28"/>
-          <w:szCs w:val="28"/>
-        </w:rPr>
-        <w:t>3</w:t>
-      </w:r>
-      <w:r>
-        <w:rPr>
-          <w:rFonts w:asciiTheme="majorBidi" w:hAnsiTheme="majorBidi" w:cstheme="majorBidi"/>
-          <w:sz w:val="28"/>
-          <w:szCs w:val="28"/>
-        </w:rPr>
-        <w:t xml:space="preserve">) </w:t>
-      </w:r>
-      <w:r>
-        <w:rPr>
-          <w:rFonts w:asciiTheme="majorBidi" w:hAnsiTheme="majorBidi" w:cstheme="majorBidi"/>
-          <w:sz w:val="28"/>
-          <w:szCs w:val="28"/>
-        </w:rPr>
-        <w:t>→ The number of consecutive check failures required before the container’s health status is reported as unhealthy.</w:t>
+        <w:t xml:space="preserve"> (default = 3) → The number of consecutive check failures required before the container’s health status is reported as unhealthy.</w:t>
       </w:r>
     </w:p>
     <w:p>
@@ -2169,95 +2140,32 @@
           <w:numId w:val="22"/>
         </w:numPr>
         <w:ind w:left="720"/>
-        <w:rPr>
-          <w:rFonts w:asciiTheme="majorBidi" w:hAnsiTheme="majorBidi" w:cstheme="majorBidi"/>
-          <w:sz w:val="28"/>
-          <w:szCs w:val="28"/>
-        </w:rPr>
-      </w:pPr>
-      <w:r>
-        <w:rPr>
-          <w:rFonts w:asciiTheme="majorBidi" w:hAnsiTheme="majorBidi" w:cstheme="majorBidi"/>
-          <w:b/>
-          <w:bCs/>
-          <w:i/>
-          <w:iCs/>
-          <w:sz w:val="28"/>
-          <w:szCs w:val="28"/>
-        </w:rPr>
-        <w:t>--timeout</w:t>
-      </w:r>
-      <w:r>
-        <w:rPr>
-          <w:rFonts w:asciiTheme="majorBidi" w:hAnsiTheme="majorBidi" w:cstheme="majorBidi"/>
-          <w:b/>
-          <w:bCs/>
-          <w:i/>
-          <w:iCs/>
-          <w:sz w:val="28"/>
-          <w:szCs w:val="28"/>
-        </w:rPr>
-        <w:t xml:space="preserve"> </w:t>
-      </w:r>
-      <w:r>
-        <w:rPr>
-          <w:rFonts w:asciiTheme="majorBidi" w:hAnsiTheme="majorBidi" w:cstheme="majorBidi"/>
-          <w:b/>
-          <w:bCs/>
-          <w:i/>
-          <w:iCs/>
-          <w:sz w:val="28"/>
-          <w:szCs w:val="28"/>
-        </w:rPr>
-        <w:t>30s</w:t>
-      </w:r>
-      <w:r>
-        <w:rPr>
-          <w:rFonts w:asciiTheme="majorBidi" w:hAnsiTheme="majorBidi" w:cstheme="majorBidi"/>
-          <w:sz w:val="28"/>
-          <w:szCs w:val="28"/>
-        </w:rPr>
-        <w:t xml:space="preserve"> </w:t>
-      </w:r>
-      <w:r>
-        <w:rPr>
-          <w:rFonts w:asciiTheme="majorBidi" w:hAnsiTheme="majorBidi" w:cstheme="majorBidi"/>
-          <w:sz w:val="28"/>
-          <w:szCs w:val="28"/>
-        </w:rPr>
-        <w:t>(default =</w:t>
-      </w:r>
-      <w:r>
-        <w:rPr>
-          <w:rFonts w:asciiTheme="majorBidi" w:hAnsiTheme="majorBidi" w:cstheme="majorBidi"/>
-          <w:sz w:val="28"/>
-          <w:szCs w:val="28"/>
-        </w:rPr>
-        <w:t xml:space="preserve"> </w:t>
-      </w:r>
-      <w:r>
-        <w:rPr>
-          <w:rFonts w:asciiTheme="majorBidi" w:hAnsiTheme="majorBidi" w:cstheme="majorBidi"/>
-          <w:sz w:val="28"/>
-          <w:szCs w:val="28"/>
-        </w:rPr>
-        <w:t>30 seconds)</w:t>
-      </w:r>
-      <w:r>
-        <w:rPr>
-          <w:rFonts w:asciiTheme="majorBidi" w:hAnsiTheme="majorBidi" w:cstheme="majorBidi"/>
-          <w:sz w:val="28"/>
-          <w:szCs w:val="28"/>
-        </w:rPr>
-        <w:t xml:space="preserve"> </w:t>
-      </w:r>
-      <w:r>
-        <w:rPr>
-          <w:rFonts w:asciiTheme="majorBidi" w:hAnsiTheme="majorBidi" w:cstheme="majorBidi"/>
-          <w:sz w:val="28"/>
-          <w:szCs w:val="28"/>
-        </w:rPr>
-        <w:t xml:space="preserve">→ The maximum time allowed for the </w:t>
+        <w:jc w:val="both"/>
+        <w:rPr>
+          <w:rFonts w:asciiTheme="majorBidi" w:hAnsiTheme="majorBidi" w:cstheme="majorBidi"/>
+          <w:sz w:val="28"/>
+          <w:szCs w:val="28"/>
+        </w:rPr>
+      </w:pPr>
+      <w:r>
+        <w:rPr>
+          <w:rFonts w:asciiTheme="majorBidi" w:hAnsiTheme="majorBidi" w:cstheme="majorBidi"/>
+          <w:b/>
+          <w:bCs/>
+          <w:i/>
+          <w:iCs/>
+          <w:sz w:val="28"/>
+          <w:szCs w:val="28"/>
+        </w:rPr>
+        <w:t>--timeout 30s</w:t>
+      </w:r>
+      <w:r>
+        <w:rPr>
+          <w:rFonts w:asciiTheme="majorBidi" w:hAnsiTheme="majorBidi" w:cstheme="majorBidi"/>
+          <w:sz w:val="28"/>
+          <w:szCs w:val="28"/>
+        </w:rPr>
+        <w:t xml:space="preserve"> (default = 30 seconds) → The maximum time allowed for the </w:t>
       </w:r>
       <w:r>
         <w:rPr>
@@ -2288,95 +2196,32 @@
           <w:numId w:val="22"/>
         </w:numPr>
         <w:ind w:left="720"/>
-        <w:rPr>
-          <w:rFonts w:asciiTheme="majorBidi" w:hAnsiTheme="majorBidi" w:cstheme="majorBidi"/>
-          <w:sz w:val="28"/>
-          <w:szCs w:val="28"/>
-        </w:rPr>
-      </w:pPr>
-      <w:r>
-        <w:rPr>
-          <w:rFonts w:asciiTheme="majorBidi" w:hAnsiTheme="majorBidi" w:cstheme="majorBidi"/>
-          <w:b/>
-          <w:bCs/>
-          <w:i/>
-          <w:iCs/>
-          <w:sz w:val="28"/>
-          <w:szCs w:val="28"/>
-        </w:rPr>
-        <w:t>--interval</w:t>
-      </w:r>
-      <w:r>
-        <w:rPr>
-          <w:rFonts w:asciiTheme="majorBidi" w:hAnsiTheme="majorBidi" w:cstheme="majorBidi"/>
-          <w:b/>
-          <w:bCs/>
-          <w:i/>
-          <w:iCs/>
-          <w:sz w:val="28"/>
-          <w:szCs w:val="28"/>
-        </w:rPr>
-        <w:t xml:space="preserve"> </w:t>
-      </w:r>
-      <w:r>
-        <w:rPr>
-          <w:rFonts w:asciiTheme="majorBidi" w:hAnsiTheme="majorBidi" w:cstheme="majorBidi"/>
-          <w:b/>
-          <w:bCs/>
-          <w:i/>
-          <w:iCs/>
-          <w:sz w:val="28"/>
-          <w:szCs w:val="28"/>
-        </w:rPr>
-        <w:t>5s</w:t>
-      </w:r>
-      <w:r>
-        <w:rPr>
-          <w:rFonts w:asciiTheme="majorBidi" w:hAnsiTheme="majorBidi" w:cstheme="majorBidi"/>
-          <w:sz w:val="28"/>
-          <w:szCs w:val="28"/>
-        </w:rPr>
-        <w:t xml:space="preserve"> </w:t>
-      </w:r>
-      <w:r>
-        <w:rPr>
-          <w:rFonts w:asciiTheme="majorBidi" w:hAnsiTheme="majorBidi" w:cstheme="majorBidi"/>
-          <w:sz w:val="28"/>
-          <w:szCs w:val="28"/>
-        </w:rPr>
-        <w:t>(</w:t>
-      </w:r>
-      <w:r>
-        <w:rPr>
-          <w:rFonts w:asciiTheme="majorBidi" w:hAnsiTheme="majorBidi" w:cstheme="majorBidi"/>
-          <w:sz w:val="28"/>
-          <w:szCs w:val="28"/>
-        </w:rPr>
-        <w:t xml:space="preserve">default = </w:t>
-      </w:r>
-      <w:r>
-        <w:rPr>
-          <w:rFonts w:asciiTheme="majorBidi" w:hAnsiTheme="majorBidi" w:cstheme="majorBidi"/>
-          <w:sz w:val="28"/>
-          <w:szCs w:val="28"/>
-        </w:rPr>
-        <w:t>5 seconds)</w:t>
-      </w:r>
-      <w:r>
-        <w:rPr>
-          <w:rFonts w:asciiTheme="majorBidi" w:hAnsiTheme="majorBidi" w:cstheme="majorBidi"/>
-          <w:sz w:val="28"/>
-          <w:szCs w:val="28"/>
-        </w:rPr>
-        <w:t xml:space="preserve"> </w:t>
-      </w:r>
-      <w:r>
-        <w:rPr>
-          <w:rFonts w:asciiTheme="majorBidi" w:hAnsiTheme="majorBidi" w:cstheme="majorBidi"/>
-          <w:sz w:val="28"/>
-          <w:szCs w:val="28"/>
-        </w:rPr>
-        <w:t>→ The time to wait between running the health check command periodically.</w:t>
+        <w:jc w:val="both"/>
+        <w:rPr>
+          <w:rFonts w:asciiTheme="majorBidi" w:hAnsiTheme="majorBidi" w:cstheme="majorBidi"/>
+          <w:sz w:val="28"/>
+          <w:szCs w:val="28"/>
+        </w:rPr>
+      </w:pPr>
+      <w:r>
+        <w:rPr>
+          <w:rFonts w:asciiTheme="majorBidi" w:hAnsiTheme="majorBidi" w:cstheme="majorBidi"/>
+          <w:b/>
+          <w:bCs/>
+          <w:i/>
+          <w:iCs/>
+          <w:sz w:val="28"/>
+          <w:szCs w:val="28"/>
+        </w:rPr>
+        <w:t>--interval 5s</w:t>
+      </w:r>
+      <w:r>
+        <w:rPr>
+          <w:rFonts w:asciiTheme="majorBidi" w:hAnsiTheme="majorBidi" w:cstheme="majorBidi"/>
+          <w:sz w:val="28"/>
+          <w:szCs w:val="28"/>
+        </w:rPr>
+        <w:t xml:space="preserve"> (default = 5 seconds) → The time to wait between running the health check command periodically.</w:t>
       </w:r>
     </w:p>
     <w:p>
@@ -2405,71 +2250,15 @@
           <w:sz w:val="28"/>
           <w:szCs w:val="28"/>
         </w:rPr>
-        <w:t>--start-period</w:t>
-      </w:r>
-      <w:r>
-        <w:rPr>
-          <w:rFonts w:asciiTheme="majorBidi" w:hAnsiTheme="majorBidi" w:cstheme="majorBidi"/>
-          <w:b/>
-          <w:bCs/>
-          <w:i/>
-          <w:iCs/>
-          <w:sz w:val="28"/>
-          <w:szCs w:val="28"/>
-        </w:rPr>
-        <w:t xml:space="preserve"> </w:t>
-      </w:r>
-      <w:r>
-        <w:rPr>
-          <w:rFonts w:asciiTheme="majorBidi" w:hAnsiTheme="majorBidi" w:cstheme="majorBidi"/>
-          <w:b/>
-          <w:bCs/>
-          <w:i/>
-          <w:iCs/>
-          <w:sz w:val="28"/>
-          <w:szCs w:val="28"/>
-        </w:rPr>
-        <w:t>0s</w:t>
-      </w:r>
-      <w:r>
-        <w:rPr>
-          <w:rFonts w:asciiTheme="majorBidi" w:hAnsiTheme="majorBidi" w:cstheme="majorBidi"/>
-          <w:sz w:val="28"/>
-          <w:szCs w:val="28"/>
-        </w:rPr>
-        <w:t xml:space="preserve"> (</w:t>
-      </w:r>
-      <w:r>
-        <w:rPr>
-          <w:rFonts w:asciiTheme="majorBidi" w:hAnsiTheme="majorBidi" w:cstheme="majorBidi"/>
-          <w:sz w:val="28"/>
-          <w:szCs w:val="28"/>
-        </w:rPr>
-        <w:t xml:space="preserve">default = </w:t>
-      </w:r>
-      <w:r>
-        <w:rPr>
-          <w:rFonts w:asciiTheme="majorBidi" w:hAnsiTheme="majorBidi" w:cstheme="majorBidi"/>
-          <w:sz w:val="28"/>
-          <w:szCs w:val="28"/>
-        </w:rPr>
-        <w:t>0 seconds)</w:t>
-      </w:r>
-      <w:r>
-        <w:rPr>
-          <w:rFonts w:asciiTheme="majorBidi" w:hAnsiTheme="majorBidi" w:cstheme="majorBidi"/>
-          <w:sz w:val="28"/>
-          <w:szCs w:val="28"/>
-        </w:rPr>
-        <w:t xml:space="preserve"> </w:t>
-      </w:r>
-      <w:r>
-        <w:rPr>
-          <w:rFonts w:asciiTheme="majorBidi" w:hAnsiTheme="majorBidi" w:cstheme="majorBidi"/>
-          <w:sz w:val="28"/>
-          <w:szCs w:val="28"/>
-        </w:rPr>
-        <w:t>→ A recovery period to allow initialization. Health check results during this period are ignored, and failures do not count towards the retry count. Useful for services that take a long time to start up.</w:t>
+        <w:t>--start-period 0s</w:t>
+      </w:r>
+      <w:r>
+        <w:rPr>
+          <w:rFonts w:asciiTheme="majorBidi" w:hAnsiTheme="majorBidi" w:cstheme="majorBidi"/>
+          <w:sz w:val="28"/>
+          <w:szCs w:val="28"/>
+        </w:rPr>
+        <w:t xml:space="preserve"> (default = 0 seconds) → A recovery period to allow initialization. Health check results during this period are ignored, and failures do not count towards the retry count. Useful for services that take a long time to start up.</w:t>
       </w:r>
     </w:p>
     <w:p>
@@ -3190,12 +2979,28 @@
           <w:sz w:val="28"/>
           <w:szCs w:val="28"/>
         </w:rPr>
-        <w:t>Does not support shell features like variable substitution ($MY_VAR would be treated literally), pipes (|), or wildcards unless you explicitly start a shell yourself (e.g., ENTRYPOINT ["</w:t>
+        <w:t xml:space="preserve">Does not support shell features like variable substitution ($MY_VAR would be treated literally), pipes (|), or wildcards unless you explicitly start a shell yourself (e.g., </w:t>
+      </w:r>
+      <w:r>
+        <w:rPr>
+          <w:rFonts w:asciiTheme="majorBidi" w:hAnsiTheme="majorBidi" w:cstheme="majorBidi"/>
+          <w:b/>
+          <w:bCs/>
+          <w:i/>
+          <w:iCs/>
+          <w:sz w:val="28"/>
+          <w:szCs w:val="28"/>
+        </w:rPr>
+        <w:t>ENTRYPOINT ["</w:t>
       </w:r>
       <w:proofErr w:type="spellStart"/>
       <w:r>
         <w:rPr>
           <w:rFonts w:asciiTheme="majorBidi" w:hAnsiTheme="majorBidi" w:cstheme="majorBidi"/>
+          <w:b/>
+          <w:bCs/>
+          <w:i/>
+          <w:iCs/>
           <w:sz w:val="28"/>
           <w:szCs w:val="28"/>
         </w:rPr>
@@ -3205,10 +3010,22 @@
       <w:r>
         <w:rPr>
           <w:rFonts w:asciiTheme="majorBidi" w:hAnsiTheme="majorBidi" w:cstheme="majorBidi"/>
-          <w:sz w:val="28"/>
-          <w:szCs w:val="28"/>
-        </w:rPr>
-        <w:t>", "-c", "echo $MY_VAR"]).</w:t>
+          <w:b/>
+          <w:bCs/>
+          <w:i/>
+          <w:iCs/>
+          <w:sz w:val="28"/>
+          <w:szCs w:val="28"/>
+        </w:rPr>
+        <w:t>", "-c", "echo $MY_VAR"]</w:t>
+      </w:r>
+      <w:r>
+        <w:rPr>
+          <w:rFonts w:asciiTheme="majorBidi" w:hAnsiTheme="majorBidi" w:cstheme="majorBidi"/>
+          <w:sz w:val="28"/>
+          <w:szCs w:val="28"/>
+        </w:rPr>
+        <w:t>).</w:t>
       </w:r>
     </w:p>
     <w:p>
@@ -4759,7 +4576,87 @@
           <w:sz w:val="28"/>
           <w:szCs w:val="28"/>
         </w:rPr>
-        <w:t>If both ENTRYPOINT and CMD are present, CMD arguments are appended to the ENTRYPOINT command.</w:t>
+        <w:t xml:space="preserve">If both </w:t>
+      </w:r>
+      <w:r>
+        <w:rPr>
+          <w:rFonts w:asciiTheme="majorBidi" w:hAnsiTheme="majorBidi" w:cstheme="majorBidi"/>
+          <w:b/>
+          <w:bCs/>
+          <w:i/>
+          <w:iCs/>
+          <w:sz w:val="28"/>
+          <w:szCs w:val="28"/>
+        </w:rPr>
+        <w:t>ENTRYPOINT</w:t>
+      </w:r>
+      <w:r>
+        <w:rPr>
+          <w:rFonts w:asciiTheme="majorBidi" w:hAnsiTheme="majorBidi" w:cstheme="majorBidi"/>
+          <w:sz w:val="28"/>
+          <w:szCs w:val="28"/>
+        </w:rPr>
+        <w:t xml:space="preserve"> and </w:t>
+      </w:r>
+      <w:r>
+        <w:rPr>
+          <w:rFonts w:asciiTheme="majorBidi" w:hAnsiTheme="majorBidi" w:cstheme="majorBidi"/>
+          <w:b/>
+          <w:bCs/>
+          <w:i/>
+          <w:iCs/>
+          <w:sz w:val="28"/>
+          <w:szCs w:val="28"/>
+        </w:rPr>
+        <w:t>CMD</w:t>
+      </w:r>
+      <w:r>
+        <w:rPr>
+          <w:rFonts w:asciiTheme="majorBidi" w:hAnsiTheme="majorBidi" w:cstheme="majorBidi"/>
+          <w:sz w:val="28"/>
+          <w:szCs w:val="28"/>
+        </w:rPr>
+        <w:t xml:space="preserve"> are present, </w:t>
+      </w:r>
+      <w:r>
+        <w:rPr>
+          <w:rFonts w:asciiTheme="majorBidi" w:hAnsiTheme="majorBidi" w:cstheme="majorBidi"/>
+          <w:b/>
+          <w:bCs/>
+          <w:i/>
+          <w:iCs/>
+          <w:sz w:val="28"/>
+          <w:szCs w:val="28"/>
+        </w:rPr>
+        <w:t>CMD</w:t>
+      </w:r>
+      <w:r>
+        <w:rPr>
+          <w:rFonts w:asciiTheme="majorBidi" w:hAnsiTheme="majorBidi" w:cstheme="majorBidi"/>
+          <w:sz w:val="28"/>
+          <w:szCs w:val="28"/>
+        </w:rPr>
+        <w:t xml:space="preserve"> arguments are appended to the </w:t>
+      </w:r>
+      <w:r>
+        <w:rPr>
+          <w:rFonts w:asciiTheme="majorBidi" w:hAnsiTheme="majorBidi" w:cstheme="majorBidi"/>
+          <w:b/>
+          <w:bCs/>
+          <w:i/>
+          <w:iCs/>
+          <w:sz w:val="28"/>
+          <w:szCs w:val="28"/>
+        </w:rPr>
+        <w:t>ENTRYPOINT</w:t>
+      </w:r>
+      <w:r>
+        <w:rPr>
+          <w:rFonts w:asciiTheme="majorBidi" w:hAnsiTheme="majorBidi" w:cstheme="majorBidi"/>
+          <w:sz w:val="28"/>
+          <w:szCs w:val="28"/>
+        </w:rPr>
+        <w:t xml:space="preserve"> command.</w:t>
       </w:r>
     </w:p>
     <w:p>
@@ -5283,6 +5180,7 @@
           <w:iCs/>
           <w:sz w:val="28"/>
           <w:szCs w:val="28"/>
+          <w:u w:val="single"/>
         </w:rPr>
         <w:t>exec "$@"</w:t>
       </w:r>
@@ -9412,7 +9310,29 @@
           <w:sz w:val="28"/>
           <w:szCs w:val="28"/>
         </w:rPr>
-        <w:t>Naming Stages (AS &lt;name&gt;)</w:t>
+        <w:t>Naming Stages (</w:t>
+      </w:r>
+      <w:r>
+        <w:rPr>
+          <w:rFonts w:asciiTheme="majorBidi" w:hAnsiTheme="majorBidi" w:cstheme="majorBidi"/>
+          <w:b/>
+          <w:bCs/>
+          <w:i/>
+          <w:iCs/>
+          <w:sz w:val="28"/>
+          <w:szCs w:val="28"/>
+        </w:rPr>
+        <w:t>AS &lt;name&gt;</w:t>
+      </w:r>
+      <w:r>
+        <w:rPr>
+          <w:rFonts w:asciiTheme="majorBidi" w:hAnsiTheme="majorBidi" w:cstheme="majorBidi"/>
+          <w:b/>
+          <w:bCs/>
+          <w:sz w:val="28"/>
+          <w:szCs w:val="28"/>
+        </w:rPr>
+        <w:t>)</w:t>
       </w:r>
     </w:p>
     <w:p>
@@ -9492,7 +9412,19 @@
           <w:sz w:val="28"/>
           <w:szCs w:val="28"/>
         </w:rPr>
-        <w:t>COPY --from=&lt;name&gt;)</w:t>
+        <w:t>COPY --from=&lt;name&gt;</w:t>
+      </w:r>
+      <w:r>
+        <w:rPr>
+          <w:rFonts w:asciiTheme="majorBidi" w:hAnsiTheme="majorBidi" w:cstheme="majorBidi"/>
+          <w:b/>
+          <w:bCs/>
+          <w:i/>
+          <w:iCs/>
+          <w:sz w:val="28"/>
+          <w:szCs w:val="28"/>
+        </w:rPr>
+        <w:t>)</w:t>
       </w:r>
     </w:p>
     <w:p>
@@ -9920,7 +9852,27 @@
           <w:sz w:val="28"/>
           <w:szCs w:val="28"/>
         </w:rPr>
-        <w:t>Docker only builds the final stage by default. If you want to build an intermediate stage (e.g., to debug the compiled artifact before the final runtime setup), you can use the --target flag during the build:</w:t>
+        <w:t xml:space="preserve">Docker only builds the final stage by default. If you want to build an intermediate stage (e.g., to debug the compiled artifact before the final runtime setup), you can use the </w:t>
+      </w:r>
+      <w:r>
+        <w:rPr>
+          <w:rFonts w:asciiTheme="majorBidi" w:hAnsiTheme="majorBidi" w:cstheme="majorBidi"/>
+          <w:b/>
+          <w:bCs/>
+          <w:i/>
+          <w:iCs/>
+          <w:sz w:val="28"/>
+          <w:szCs w:val="28"/>
+        </w:rPr>
+        <w:t>--target</w:t>
+      </w:r>
+      <w:r>
+        <w:rPr>
+          <w:rFonts w:asciiTheme="majorBidi" w:hAnsiTheme="majorBidi" w:cstheme="majorBidi"/>
+          <w:sz w:val="28"/>
+          <w:szCs w:val="28"/>
+        </w:rPr>
+        <w:t xml:space="preserve"> flag during the build:</w:t>
       </w:r>
     </w:p>
     <w:p>
@@ -10488,7 +10440,6 @@
                               <w:t>json</w:t>
                             </w:r>
                             <w:proofErr w:type="spellEnd"/>
-                            <w:proofErr w:type="gramEnd"/>
                             <w:r>
                               <w:rPr>
                                 <w:rFonts w:asciiTheme="majorBidi" w:hAnsiTheme="majorBidi" w:cstheme="majorBidi"/>
@@ -10501,6 +10452,7 @@
                               </w:rPr>
                               <w:t xml:space="preserve"> ./</w:t>
                             </w:r>
+                            <w:proofErr w:type="gramEnd"/>
                           </w:p>
                           <w:p>
                             <w:pPr>
@@ -13895,15 +13847,7 @@
           <w:sz w:val="28"/>
           <w:szCs w:val="28"/>
         </w:rPr>
-        <w:t xml:space="preserve"> </w:t>
-      </w:r>
-      <w:r>
-        <w:rPr>
-          <w:rFonts w:asciiTheme="majorBidi" w:hAnsiTheme="majorBidi" w:cstheme="majorBidi"/>
-          <w:sz w:val="28"/>
-          <w:szCs w:val="28"/>
-        </w:rPr>
-        <w:t xml:space="preserve">→ Build Context: This crucial part specifies the location of the build context. The dot (.) means the current directory contains the </w:t>
+        <w:t xml:space="preserve"> → Build Context: This crucial part specifies the location of the build context. The dot (.) means the current directory contains the </w:t>
       </w:r>
       <w:proofErr w:type="spellStart"/>
       <w:r>
@@ -14131,25 +14075,7 @@
           <w:szCs w:val="28"/>
           <w:u w:val="single"/>
         </w:rPr>
-        <w:t xml:space="preserve">Important </w:t>
-      </w:r>
-      <w:r>
-        <w:rPr>
-          <w:rFonts w:asciiTheme="majorBidi" w:hAnsiTheme="majorBidi" w:cstheme="majorBidi"/>
-          <w:sz w:val="28"/>
-          <w:szCs w:val="28"/>
-          <w:u w:val="single"/>
-        </w:rPr>
-        <w:t>Options</w:t>
-      </w:r>
-      <w:r>
-        <w:rPr>
-          <w:rFonts w:asciiTheme="majorBidi" w:hAnsiTheme="majorBidi" w:cstheme="majorBidi"/>
-          <w:sz w:val="28"/>
-          <w:szCs w:val="28"/>
-          <w:u w:val="single"/>
-        </w:rPr>
-        <w:t>:</w:t>
+        <w:t>Important Options:</w:t>
       </w:r>
     </w:p>
     <w:p>
@@ -14172,23 +14098,7 @@
           <w:sz w:val="28"/>
           <w:szCs w:val="28"/>
         </w:rPr>
-        <w:t>--no-cache</w:t>
-      </w:r>
-      <w:r>
-        <w:rPr>
-          <w:rFonts w:asciiTheme="majorBidi" w:hAnsiTheme="majorBidi" w:cstheme="majorBidi"/>
-          <w:sz w:val="28"/>
-          <w:szCs w:val="28"/>
-        </w:rPr>
-        <w:t xml:space="preserve"> </w:t>
-      </w:r>
-      <w:r>
-        <w:rPr>
-          <w:rFonts w:asciiTheme="majorBidi" w:hAnsiTheme="majorBidi" w:cstheme="majorBidi"/>
-          <w:sz w:val="28"/>
-          <w:szCs w:val="28"/>
-        </w:rPr>
-        <w:t xml:space="preserve">→ Forces Docker to ignore any existing cache layers and re-run every instruction in the </w:t>
+        <w:t xml:space="preserve">--no-cache → Forces Docker to ignore any existing cache layers and re-run every instruction in the </w:t>
       </w:r>
       <w:proofErr w:type="spellStart"/>
       <w:r>
@@ -14271,15 +14181,7 @@
           <w:sz w:val="28"/>
           <w:szCs w:val="28"/>
         </w:rPr>
-        <w:t xml:space="preserve"> </w:t>
-      </w:r>
-      <w:r>
-        <w:rPr>
-          <w:rFonts w:asciiTheme="majorBidi" w:hAnsiTheme="majorBidi" w:cstheme="majorBidi"/>
-          <w:sz w:val="28"/>
-          <w:szCs w:val="28"/>
-        </w:rPr>
-        <w:t xml:space="preserve">→ Passes runtime </w:t>
+        <w:t xml:space="preserve"> → Passes runtime </w:t>
       </w:r>
       <w:proofErr w:type="gramStart"/>
       <w:r>
@@ -14438,15 +14340,7 @@
           <w:sz w:val="28"/>
           <w:szCs w:val="28"/>
         </w:rPr>
-        <w:t xml:space="preserve"> or is not located in the build context root.</w:t>
-      </w:r>
-      <w:r>
-        <w:rPr>
-          <w:rFonts w:asciiTheme="majorBidi" w:hAnsiTheme="majorBidi" w:cstheme="majorBidi"/>
-          <w:sz w:val="28"/>
-          <w:szCs w:val="28"/>
-        </w:rPr>
-        <w:t xml:space="preserve"> Example:</w:t>
+        <w:t xml:space="preserve"> or is not located in the build context root. Example:</w:t>
       </w:r>
     </w:p>
     <w:p>

</xml_diff>